<commit_message>
chore: aggiorna doc + .txt — un solo account operatore (admin@ rimosso)
- master_account.txt, Silvestre_Accounts.txt, TODO: solo operatore@
- generate_manuale_generale.py: bullet 'GIÀ A POSTO' aggiornato
- generate_firebase_doc.py: modello ruoli ridotto a customer + admin
- firestore_schema.md: 'staff' rimosso da orders
- purge_customers.py: PRESERVE_EMAILS solo operatore@
- Tutti i 5 .docx + 5 .pdf rigenerati

Co-Authored-By: Claude Opus 4.7 (1M context) <noreply@anthropic.com>
</commit_message>
<xml_diff>
--- a/docs/3_Guida_Firebase.docx
+++ b/docs/3_Guida_Firebase.docx
@@ -985,19 +985,19 @@
           <w:rFonts w:ascii="Calibri" w:hAnsi="Calibri"/>
           <w:sz w:val="22"/>
         </w:rPr>
-        <w:t>staff — dipendente del negozio (vede tutti gli ordini, può cambiarne lo stato).</w:t>
+        <w:t>admin — unico account operatore condiviso (operatore@silvestrefotoservizi.it). Tutti i permessi: vede ordini, cambia stato, gestisce prodotti/prezzi, rimuove ordini, gestisce altri account.</w:t>
       </w:r>
     </w:p>
     <w:p>
-      <w:pPr>
-        <w:pStyle w:val="ListBullet"/>
-      </w:pPr>
       <w:r>
         <w:rPr>
           <w:rFonts w:ascii="Calibri" w:hAnsi="Calibri"/>
+          <w:b w:val="0"/>
+          <w:i/>
+          <w:color w:val="2B2B2B"/>
           <w:sz w:val="22"/>
         </w:rPr>
-        <w:t>admin — proprietario (CRUD prodotti, gestione staff, cancellazione ordini).</w:t>
+        <w:t>Storicamente esistevano 3 ruoli (customer/staff/admin) ma sono stati unificati in 2 (customer/admin) per semplicità operativa.</w:t>
       </w:r>
     </w:p>
     <w:p>

</xml_diff>